<commit_message>
Lab1: 10 receiver kits in 2 batches; shorter data file names; updated tutorial, slides and report template; remove remaining Chinese from Lab2 slides
Co-authored-by: Cursor <cursoragent@cursor.com>
</commit_message>
<xml_diff>
--- a/Lab1/PolyU_AAE4203_Lab_report_template.docx
+++ b/Lab1/PolyU_AAE4203_Lab_report_template.docx
@@ -200,47 +200,24 @@
       </w:r>
       <w:r>
         <w:tab/>
-        <w:t xml:space="preserve">Alice Lee (Leader); Bob </w:t>
-      </w:r>
-      <w:r>
-        <w:rPr>
-          <w:spacing w:val="-4"/>
-        </w:rPr>
-        <w:t xml:space="preserve">Wong; </w:t>
-      </w:r>
-      <w:r>
-        <w:t xml:space="preserve">Charlie </w:t>
-      </w:r>
-      <w:r>
-        <w:rPr>
-          <w:spacing w:val="-7"/>
-        </w:rPr>
-        <w:t xml:space="preserve">Ho </w:t>
-      </w:r>
-      <w:r>
-        <w:t>Member</w:t>
-      </w:r>
-      <w:r>
-        <w:rPr>
-          <w:spacing w:val="-3"/>
-        </w:rPr>
-        <w:t xml:space="preserve"> </w:t>
-      </w:r>
-      <w:r>
-        <w:t>IDs:</w:t>
+        <w:t>Alice Lee (Leader); Bob Wong; Charlie Ho</w:t>
+      </w:r>
+    </w:p>
+    <w:p>
+      <w:pPr>
+        <w:pStyle w:val="a3"/>
+        <w:tabs>
+          <w:tab w:val="left" w:pos="2420"/>
+        </w:tabs>
+        <w:spacing w:before="83" w:line="288" w:lineRule="auto"/>
+        <w:ind w:left="423" w:right="3122"/>
+      </w:pPr>
+      <w:r>
+        <w:t>Member IDs:</w:t>
       </w:r>
       <w:r>
         <w:tab/>
-        <w:t>12345678; 23456789;</w:t>
-      </w:r>
-      <w:r>
-        <w:rPr>
-          <w:spacing w:val="10"/>
-        </w:rPr>
-        <w:t xml:space="preserve"> </w:t>
-      </w:r>
-      <w:r>
-        <w:t>34567890</w:t>
+        <w:t>23123456D; 23234567D; 23345678D</w:t>
       </w:r>
     </w:p>
     <w:p>
@@ -289,35 +266,24 @@
       </w:r>
       <w:r>
         <w:tab/>
-        <w:t xml:space="preserve">Department of Aeronautical and </w:t>
-      </w:r>
-      <w:r>
-        <w:rPr>
-          <w:spacing w:val="-3"/>
-        </w:rPr>
-        <w:t>Aviation</w:t>
-      </w:r>
-      <w:r>
-        <w:rPr>
-          <w:spacing w:val="-25"/>
-        </w:rPr>
-        <w:t xml:space="preserve"> </w:t>
-      </w:r>
-      <w:r>
-        <w:t>Engineering School:</w:t>
+        <w:t>Department of Aeronautical and Aviation Engineering</w:t>
+      </w:r>
+    </w:p>
+    <w:p>
+      <w:pPr>
+        <w:pStyle w:val="a3"/>
+        <w:tabs>
+          <w:tab w:val="left" w:pos="2420"/>
+        </w:tabs>
+        <w:spacing w:before="82" w:line="288" w:lineRule="auto"/>
+        <w:ind w:left="423" w:right="2204"/>
+      </w:pPr>
+      <w:r>
+        <w:t>School:</w:t>
       </w:r>
       <w:r>
         <w:tab/>
-        <w:t>The Hong Kong Polytechnic</w:t>
-      </w:r>
-      <w:r>
-        <w:rPr>
-          <w:spacing w:val="-12"/>
-        </w:rPr>
-        <w:t xml:space="preserve"> </w:t>
-      </w:r>
-      <w:r>
-        <w:t>University</w:t>
+        <w:t>The Hong Kong Polytechnic University</w:t>
       </w:r>
     </w:p>
     <w:p>
@@ -399,7 +365,7 @@
         <w:jc w:val="both"/>
       </w:pPr>
       <w:r>
-        <w:t>This template demonstrates how to structure a PolyU lab report using the hkpolyu-labreport class. It includes examples of figures, tables, equations, code listings, and citations, while con- forming to page and submission requirements.</w:t>
+        <w:t>Summarise in 150–200 words what your group did and found: the data you collected near Block X, your SPP method and the improvements you tested, the own-data validation, and your final benchmark accuracy (2D RMSE, availability and leaderboard rank).</w:t>
       </w:r>
     </w:p>
     <w:p>
@@ -416,7 +382,7 @@
         <w:t xml:space="preserve">Keywords: </w:t>
       </w:r>
       <w:r>
-        <w:t>template, GNSS, SPP, least squares, figures, tables, citations, code</w:t>
+        <w:t>GNSS, single point positioning, weighted least squares, urban positioning, UrbanNav</w:t>
       </w:r>
     </w:p>
     <w:p>
@@ -461,6 +427,9 @@
           <w:sz w:val="15"/>
         </w:rPr>
         <w:sectPr>
+          <w:footerReference w:type="default" r:id="rId13"/>
+          <w:footerReference w:type="first" r:id="rId14"/>
+          <w:footerReference w:type="even" r:id="rId15"/>
           <w:type w:val="continuous"/>
           <w:pgSz w:w="11910" w:h="16840"/>
           <w:pgMar w:top="1580" w:right="1200" w:bottom="280" w:left="880" w:header="720" w:footer="720" w:gutter="0"/>
@@ -512,20 +481,7 @@
         <w:rPr>
           <w:sz w:val="24"/>
         </w:rPr>
-        <w:t>Fill metadata fields (title, author, student ID, course info) at the top of this</w:t>
-      </w:r>
-      <w:r>
-        <w:rPr>
-          <w:spacing w:val="-39"/>
-          <w:sz w:val="24"/>
-        </w:rPr>
-        <w:t xml:space="preserve"> </w:t>
-      </w:r>
-      <w:r>
-        <w:rPr>
-          <w:sz w:val="24"/>
-        </w:rPr>
-        <w:t>file.</w:t>
+        <w:t>Fill in the cover fields: title, group number, members and student IDs.</w:t>
       </w:r>
     </w:p>
     <w:p>
@@ -584,46 +540,30 @@
         <w:rPr>
           <w:sz w:val="24"/>
         </w:rPr>
-        <w:t xml:space="preserve">Put complete, well-documented source code and </w:t>
-      </w:r>
-      <w:r>
-        <w:rPr>
-          <w:spacing w:val="-3"/>
+        <w:t>Put complete, documented source code and raw data in your GitHub repository and give its link in the report.</w:t>
+      </w:r>
+    </w:p>
+    <w:p>
+      <w:pPr>
+        <w:pStyle w:val="a8"/>
+        <w:numPr>
+          <w:ilvl w:val="0"/>
+          <w:numId w:val="2"/>
+        </w:numPr>
+        <w:tabs>
+          <w:tab w:val="left" w:pos="564"/>
+        </w:tabs>
+        <w:spacing w:before="82" w:line="288" w:lineRule="auto"/>
+        <w:ind w:left="563" w:hanging="141"/>
+        <w:rPr>
           <w:sz w:val="24"/>
         </w:rPr>
-        <w:t xml:space="preserve">raw </w:t>
-      </w:r>
+      </w:pPr>
       <w:r>
         <w:rPr>
           <w:sz w:val="24"/>
         </w:rPr>
-        <w:t xml:space="preserve">data in </w:t>
-      </w:r>
-      <w:r>
-        <w:rPr>
-          <w:spacing w:val="-3"/>
-          <w:sz w:val="24"/>
-        </w:rPr>
-        <w:t xml:space="preserve">your </w:t>
-      </w:r>
-      <w:r>
-        <w:rPr>
-          <w:sz w:val="24"/>
-        </w:rPr>
-        <w:t>GitHub</w:t>
-      </w:r>
-      <w:r>
-        <w:rPr>
-          <w:spacing w:val="-22"/>
-          <w:sz w:val="24"/>
-        </w:rPr>
-        <w:t xml:space="preserve"> </w:t>
-      </w:r>
-      <w:r>
-        <w:rPr>
-          <w:sz w:val="24"/>
-        </w:rPr>
-        <w:t>repository.</w:t>
+        <w:t>Follow the six parts required by the lab tutorial (data collection, raw data analysis, SPP algorithm, own-data validation, benchmark results, AI-use statement); delete this section before submission.</w:t>
       </w:r>
     </w:p>
     <w:p>
@@ -664,139 +604,7 @@
         <w:jc w:val="both"/>
       </w:pPr>
       <w:r>
-        <w:t>Describe</w:t>
-      </w:r>
-      <w:r>
-        <w:rPr>
-          <w:spacing w:val="-14"/>
-        </w:rPr>
-        <w:t xml:space="preserve"> </w:t>
-      </w:r>
-      <w:r>
-        <w:t>the</w:t>
-      </w:r>
-      <w:r>
-        <w:rPr>
-          <w:spacing w:val="-12"/>
-        </w:rPr>
-        <w:t xml:space="preserve"> </w:t>
-      </w:r>
-      <w:r>
-        <w:t>data</w:t>
-      </w:r>
-      <w:r>
-        <w:rPr>
-          <w:spacing w:val="-13"/>
-        </w:rPr>
-        <w:t xml:space="preserve"> </w:t>
-      </w:r>
-      <w:r>
-        <w:t>collection</w:t>
-      </w:r>
-      <w:r>
-        <w:rPr>
-          <w:spacing w:val="-14"/>
-        </w:rPr>
-        <w:t xml:space="preserve"> </w:t>
-      </w:r>
-      <w:r>
-        <w:t>process</w:t>
-      </w:r>
-      <w:r>
-        <w:rPr>
-          <w:spacing w:val="-13"/>
-        </w:rPr>
-        <w:t xml:space="preserve"> </w:t>
-      </w:r>
-      <w:r>
-        <w:t>conducted</w:t>
-      </w:r>
-      <w:r>
-        <w:rPr>
-          <w:spacing w:val="-12"/>
-        </w:rPr>
-        <w:t xml:space="preserve"> </w:t>
-      </w:r>
-      <w:r>
-        <w:t>near</w:t>
-      </w:r>
-      <w:r>
-        <w:rPr>
-          <w:spacing w:val="-13"/>
-        </w:rPr>
-        <w:t xml:space="preserve"> </w:t>
-      </w:r>
-      <w:r>
-        <w:t>Block</w:t>
-      </w:r>
-      <w:r>
-        <w:rPr>
-          <w:spacing w:val="-14"/>
-        </w:rPr>
-        <w:t xml:space="preserve"> </w:t>
-      </w:r>
-      <w:r>
-        <w:t>X:</w:t>
-      </w:r>
-      <w:r>
-        <w:rPr>
-          <w:spacing w:val="-12"/>
-        </w:rPr>
-        <w:t xml:space="preserve"> </w:t>
-      </w:r>
-      <w:r>
-        <w:t>-</w:t>
-      </w:r>
-      <w:r>
-        <w:rPr>
-          <w:spacing w:val="-13"/>
-        </w:rPr>
-        <w:t xml:space="preserve"> </w:t>
-      </w:r>
-      <w:r>
-        <w:t>Hardware</w:t>
-      </w:r>
-      <w:r>
-        <w:rPr>
-          <w:spacing w:val="-13"/>
-        </w:rPr>
-        <w:t xml:space="preserve"> </w:t>
-      </w:r>
-      <w:r>
-        <w:t>setup</w:t>
-      </w:r>
-      <w:r>
-        <w:rPr>
-          <w:spacing w:val="-13"/>
-        </w:rPr>
-        <w:t xml:space="preserve"> </w:t>
-      </w:r>
-      <w:r>
-        <w:t>(receiver,</w:t>
-      </w:r>
-      <w:r>
-        <w:rPr>
-          <w:spacing w:val="-11"/>
-        </w:rPr>
-        <w:t xml:space="preserve"> </w:t>
-      </w:r>
-      <w:r>
-        <w:t xml:space="preserve">antenna, mount height). - Software tools (logging, parsing). - Environmental conditions (obstructions, </w:t>
-      </w:r>
-      <w:r>
-        <w:rPr>
-          <w:spacing w:val="-3"/>
-        </w:rPr>
-        <w:t>weather,</w:t>
-      </w:r>
-      <w:r>
-        <w:rPr>
-          <w:spacing w:val="-1"/>
-        </w:rPr>
-        <w:t xml:space="preserve"> </w:t>
-      </w:r>
-      <w:r>
-        <w:t>time).</w:t>
+        <w:t>Describe the data collection near Block X: hardware set-up (u-blox ZED-F9P receiver, antenna, mounting), software (u-center version, logged messages), site, start and end time, weather and surroundings (buildings, trees, sky view).</w:t>
       </w:r>
     </w:p>
     <w:p>
@@ -1225,24 +1033,7 @@
                 <w:sz w:val="24"/>
                 <w:szCs w:val="24"/>
               </w:rPr>
-              <w:t>30 min @ 1</w:t>
-            </w:r>
-            <w:r>
-              <w:rPr>
-                <w:color w:val="000000"/>
-                <w:spacing w:val="-6"/>
-                <w:sz w:val="24"/>
-                <w:szCs w:val="24"/>
-              </w:rPr>
-              <w:t xml:space="preserve"> </w:t>
-            </w:r>
-            <w:r>
-              <w:rPr>
-                <w:color w:val="000000"/>
-                <w:sz w:val="24"/>
-                <w:szCs w:val="24"/>
-              </w:rPr>
-              <w:t>Hz</w:t>
+              <w:t>15–20 min static, 1 Hz</w:t>
             </w:r>
           </w:p>
         </w:tc>
@@ -1308,7 +1099,7 @@
                 <w:sz w:val="24"/>
                 <w:szCs w:val="24"/>
               </w:rPr>
-              <w:t>Multi-constellation GNSS</w:t>
+              <w:t>u-blox ZED-F9P (kit Kxx)</w:t>
             </w:r>
           </w:p>
         </w:tc>
@@ -1325,7 +1116,7 @@
         <w:pStyle w:val="a3"/>
         <w:spacing w:before="6" w:line="288" w:lineRule="auto"/>
         <w:rPr>
-          <w:rFonts w:eastAsia="宋体"/>
+          <w:rFonts w:eastAsia="SimSun"/>
           <w:sz w:val="22"/>
           <w:lang w:eastAsia="zh-CN"/>
         </w:rPr>
@@ -1357,7 +1148,7 @@
         <w:ind w:left="423"/>
       </w:pPr>
       <w:r>
-        <w:t>Summarize raw measurements and quality indicators: - Observed satellites per epoch, C/N0, GDOP, flags.</w:t>
+        <w:t>Summarise the raw measurements: satellites tracked per constellation, C/N0, elevation and sky plot, DOP and other quality indicators.</w:t>
       </w:r>
     </w:p>
     <w:p>
@@ -1377,46 +1168,7 @@
         </w:rPr>
       </w:pPr>
       <w:r>
-        <w:pict w14:anchorId="2AF9B4D4">
-          <v:shape id="_x0000_s2057" style="position:absolute;left:0;text-align:left;margin-left:100.05pt;margin-top:48.95pt;width:395.2pt;height:296.4pt;z-index:-251659264;mso-position-horizontal-relative:page;mso-width-relative:page;mso-height-relative:page" coordorigin="2001,980" coordsize="7904,5928" o:spt="100" adj="0,,0" path="m2001,6908l9905,980t,5928l2001,980e" filled="f" strokecolor="#999" strokeweight=".34722mm">
-            <v:stroke joinstyle="round"/>
-            <v:formulas/>
-            <v:path arrowok="t" o:connecttype="segments"/>
-            <w10:wrap anchorx="page"/>
-          </v:shape>
-        </w:pict>
-      </w:r>
-      <w:r>
-        <w:rPr>
-          <w:sz w:val="24"/>
-        </w:rPr>
-        <w:t xml:space="preserve">Include concise plots and </w:t>
-      </w:r>
-      <w:r>
-        <w:rPr>
-          <w:spacing w:val="-3"/>
-          <w:sz w:val="24"/>
-        </w:rPr>
-        <w:t xml:space="preserve">references. </w:t>
-      </w:r>
-      <w:r>
-        <w:rPr>
-          <w:sz w:val="24"/>
-        </w:rPr>
-        <w:t>Example figure (C/N0 vs.</w:t>
-      </w:r>
-      <w:r>
-        <w:rPr>
-          <w:spacing w:val="-1"/>
-          <w:sz w:val="24"/>
-        </w:rPr>
-        <w:t xml:space="preserve"> </w:t>
-      </w:r>
-      <w:r>
-        <w:rPr>
-          <w:sz w:val="24"/>
-        </w:rPr>
-        <w:t>time):</w:t>
+        <w:t>Include concise plots. Example figure (C/N0 versus time):</w:t>
       </w:r>
     </w:p>
     <w:p>
@@ -1902,7 +1654,7 @@
                 <w:rFonts w:ascii="Cambria Math" w:eastAsia="Calibri" w:hAnsi="Cambria Math"/>
                 <w:sz w:val="24"/>
               </w:rPr>
-              <m:t>T</m:t>
+              <m:t>⊤</m:t>
             </m:r>
           </m:sup>
         </m:sSup>
@@ -1946,48 +1698,7 @@
         <w:ind w:left="423"/>
       </w:pPr>
       <w:r>
-        <w:t xml:space="preserve">where </w:t>
-      </w:r>
-      <w:r>
-        <w:rPr>
-          <w:b/>
-        </w:rPr>
-        <w:t xml:space="preserve">W </w:t>
-      </w:r>
-      <w:r>
-        <w:t>can be identity (unweighted) or designed from elevation</w:t>
-      </w:r>
-      <w:r>
-        <w:rPr>
-          <w:rFonts w:eastAsia="宋体" w:hint="eastAsia"/>
-          <w:lang w:eastAsia="zh-CN"/>
-        </w:rPr>
-        <w:t xml:space="preserve"> </w:t>
-      </w:r>
-      <w:r>
-        <w:t>C/N0 [</w:t>
-      </w:r>
-      <w:hyperlink w:anchor="_bookmark2" w:history="1">
-        <w:r>
-          <w:rPr>
-            <w:color w:val="000000"/>
-          </w:rPr>
-          <w:t>1</w:t>
-        </w:r>
-      </w:hyperlink>
-      <w:r>
-        <w:t xml:space="preserve">, </w:t>
-      </w:r>
-      <w:hyperlink w:anchor="_bookmark3" w:history="1">
-        <w:r>
-          <w:rPr>
-            <w:color w:val="000000"/>
-          </w:rPr>
-          <w:t>2</w:t>
-        </w:r>
-      </w:hyperlink>
-      <w:r>
-        <w:t>].</w:t>
+        <w:t>where W can be the identity matrix (unweighted) or built from the elevation or C/N0 of each satellite [1, 2].</w:t>
       </w:r>
     </w:p>
     <w:p>
@@ -4618,7 +4329,7 @@
         <w:rPr>
           <w:color w:val="000000"/>
         </w:rPr>
-        <w:t>Results and Discussion</w:t>
+        <w:t>Own-Data Validation</w:t>
       </w:r>
     </w:p>
     <w:p>
@@ -4628,97 +4339,7 @@
         <w:ind w:left="423" w:right="97"/>
       </w:pPr>
       <w:r>
-        <w:t>Present</w:t>
-      </w:r>
-      <w:r>
-        <w:rPr>
-          <w:spacing w:val="-30"/>
-        </w:rPr>
-        <w:t xml:space="preserve"> </w:t>
-      </w:r>
-      <w:r>
-        <w:t>positioning</w:t>
-      </w:r>
-      <w:r>
-        <w:rPr>
-          <w:spacing w:val="-29"/>
-        </w:rPr>
-        <w:t xml:space="preserve"> </w:t>
-      </w:r>
-      <w:r>
-        <w:t>outputs,</w:t>
-      </w:r>
-      <w:r>
-        <w:rPr>
-          <w:spacing w:val="-24"/>
-        </w:rPr>
-        <w:t xml:space="preserve"> </w:t>
-      </w:r>
-      <w:r>
-        <w:t>concise</w:t>
-      </w:r>
-      <w:r>
-        <w:rPr>
-          <w:spacing w:val="-30"/>
-        </w:rPr>
-        <w:t xml:space="preserve"> </w:t>
-      </w:r>
-      <w:r>
-        <w:t>error</w:t>
-      </w:r>
-      <w:r>
-        <w:rPr>
-          <w:spacing w:val="-29"/>
-        </w:rPr>
-        <w:t xml:space="preserve"> </w:t>
-      </w:r>
-      <w:r>
-        <w:t>analysis,</w:t>
-      </w:r>
-      <w:r>
-        <w:rPr>
-          <w:spacing w:val="-24"/>
-        </w:rPr>
-        <w:t xml:space="preserve"> </w:t>
-      </w:r>
-      <w:r>
-        <w:t>and</w:t>
-      </w:r>
-      <w:r>
-        <w:rPr>
-          <w:spacing w:val="-29"/>
-        </w:rPr>
-        <w:t xml:space="preserve"> </w:t>
-      </w:r>
-      <w:r>
-        <w:t>urban-environment</w:t>
-      </w:r>
-      <w:r>
-        <w:rPr>
-          <w:spacing w:val="-29"/>
-        </w:rPr>
-        <w:t xml:space="preserve"> </w:t>
-      </w:r>
-      <w:r>
-        <w:t>interpretation.</w:t>
-      </w:r>
-      <w:r>
-        <w:rPr>
-          <w:spacing w:val="9"/>
-        </w:rPr>
-        <w:t xml:space="preserve"> </w:t>
-      </w:r>
-      <w:r>
-        <w:t>Example figure (position</w:t>
-      </w:r>
-      <w:r>
-        <w:rPr>
-          <w:spacing w:val="-3"/>
-        </w:rPr>
-        <w:t xml:space="preserve"> </w:t>
-      </w:r>
-      <w:r>
-        <w:t>scatter):</w:t>
+        <w:t>Compare your SPP solution of your own data with the RTKPOST solution and with the receiver solution (NAV-HPPOSECEF): mean and standard deviation of the East/North/Up differences, an East–North scatter of the static solution about its mean, and input checks. Agreement between solutions is not accuracy. Example figure (position scatter):</w:t>
       </w:r>
     </w:p>
     <w:tbl>
@@ -4808,10 +4429,7 @@
         <w:rPr>
           <w:b/>
         </w:rPr>
-        <w:t xml:space="preserve">Figure 3: </w:t>
-      </w:r>
-      <w:r>
-        <w:t>Position scatter (placeholder).</w:t>
+        <w:t>Figure 3: East–North scatter of your static solution about its mean (placeholder).</w:t>
       </w:r>
     </w:p>
     <w:p>
@@ -4830,7 +4448,7 @@
         <w:ind w:left="892"/>
       </w:pPr>
       <w:r>
-        <w:t>Example table (error metrics):</w:t>
+        <w:t>Example table (validation statistics):</w:t>
       </w:r>
     </w:p>
     <w:p>
@@ -4843,10 +4461,7 @@
         <w:rPr>
           <w:b/>
         </w:rPr>
-        <w:t xml:space="preserve">Table 2: </w:t>
-      </w:r>
-      <w:r>
-        <w:t>Error metrics (example format).</w:t>
+        <w:t>Table 2: Differences between solutions for your own data (example format).</w:t>
       </w:r>
     </w:p>
     <w:p>
@@ -4861,7 +4476,7 @@
     <w:tbl>
       <w:tblPr>
         <w:tblW w:w="0" w:type="auto"/>
-        <w:tblInd w:w="2931" w:type="dxa"/>
+        <w:jc w:val="center"/>
         <w:tblLayout w:type="fixed"/>
         <w:tblCellMar>
           <w:left w:w="0" w:type="dxa"/>
@@ -4870,9 +4485,9 @@
         <w:tblLook w:val="04A0" w:firstRow="1" w:lastRow="0" w:firstColumn="1" w:lastColumn="0" w:noHBand="0" w:noVBand="1"/>
       </w:tblPr>
       <w:tblGrid>
-        <w:gridCol w:w="1700"/>
-        <w:gridCol w:w="1386"/>
-        <w:gridCol w:w="1152"/>
+        <w:gridCol w:w="3000"/>
+        <w:gridCol w:w="2000"/>
+        <w:gridCol w:w="2000"/>
       </w:tblGrid>
       <w:tr>
         <w:trPr>
@@ -4880,7 +4495,7 @@
         </w:trPr>
         <w:tc>
           <w:tcPr>
-            <w:tcW w:w="1700" w:type="dxa"/>
+            <w:tcW w:w="3000" w:type="dxa"/>
             <w:tcBorders>
               <w:top w:val="single" w:sz="8" w:space="0" w:color="000000"/>
               <w:bottom w:val="single" w:sz="6" w:space="0" w:color="000000"/>
@@ -4899,13 +4514,13 @@
               <w:rPr>
                 <w:sz w:val="24"/>
               </w:rPr>
-              <w:t>Metric</w:t>
+              <w:t>Statistic</w:t>
             </w:r>
           </w:p>
         </w:tc>
         <w:tc>
           <w:tcPr>
-            <w:tcW w:w="1386" w:type="dxa"/>
+            <w:tcW w:w="2000" w:type="dxa"/>
             <w:tcBorders>
               <w:top w:val="single" w:sz="8" w:space="0" w:color="000000"/>
               <w:bottom w:val="single" w:sz="6" w:space="0" w:color="000000"/>
@@ -4925,13 +4540,13 @@
               <w:rPr>
                 <w:sz w:val="24"/>
               </w:rPr>
-              <w:t>Unweighted</w:t>
+              <w:t>SPP − RTKPOST</w:t>
             </w:r>
           </w:p>
         </w:tc>
         <w:tc>
           <w:tcPr>
-            <w:tcW w:w="1152" w:type="dxa"/>
+            <w:tcW w:w="2000" w:type="dxa"/>
             <w:tcBorders>
               <w:top w:val="single" w:sz="8" w:space="0" w:color="000000"/>
               <w:bottom w:val="single" w:sz="6" w:space="0" w:color="000000"/>
@@ -4951,7 +4566,7 @@
               <w:rPr>
                 <w:sz w:val="24"/>
               </w:rPr>
-              <w:t>Weighted</w:t>
+              <w:t>SPP − receiver</w:t>
             </w:r>
           </w:p>
         </w:tc>
@@ -4962,7 +4577,7 @@
         </w:trPr>
         <w:tc>
           <w:tcPr>
-            <w:tcW w:w="1700" w:type="dxa"/>
+            <w:tcW w:w="3000" w:type="dxa"/>
             <w:tcBorders>
               <w:top w:val="single" w:sz="6" w:space="0" w:color="000000"/>
             </w:tcBorders>
@@ -4980,13 +4595,13 @@
               <w:rPr>
                 <w:sz w:val="24"/>
               </w:rPr>
-              <w:t>Mean HPE (m)</w:t>
+              <w:t>Mean E / N / U (m)</w:t>
             </w:r>
           </w:p>
         </w:tc>
         <w:tc>
           <w:tcPr>
-            <w:tcW w:w="1386" w:type="dxa"/>
+            <w:tcW w:w="2000" w:type="dxa"/>
             <w:tcBorders>
               <w:top w:val="single" w:sz="6" w:space="0" w:color="000000"/>
             </w:tcBorders>
@@ -5011,7 +4626,7 @@
         </w:tc>
         <w:tc>
           <w:tcPr>
-            <w:tcW w:w="1152" w:type="dxa"/>
+            <w:tcW w:w="2000" w:type="dxa"/>
             <w:tcBorders>
               <w:top w:val="single" w:sz="6" w:space="0" w:color="000000"/>
             </w:tcBorders>
@@ -5041,7 +4656,7 @@
         </w:trPr>
         <w:tc>
           <w:tcPr>
-            <w:tcW w:w="1700" w:type="dxa"/>
+            <w:tcW w:w="3000" w:type="dxa"/>
           </w:tcPr>
           <w:p>
             <w:pPr>
@@ -5056,13 +4671,13 @@
               <w:rPr>
                 <w:sz w:val="24"/>
               </w:rPr>
-              <w:t>Std HPE (m)</w:t>
+              <w:t>Std E / N / U (m)</w:t>
             </w:r>
           </w:p>
         </w:tc>
         <w:tc>
           <w:tcPr>
-            <w:tcW w:w="1386" w:type="dxa"/>
+            <w:tcW w:w="2000" w:type="dxa"/>
           </w:tcPr>
           <w:p>
             <w:pPr>
@@ -5084,7 +4699,7 @@
         </w:tc>
         <w:tc>
           <w:tcPr>
-            <w:tcW w:w="1152" w:type="dxa"/>
+            <w:tcW w:w="2000" w:type="dxa"/>
           </w:tcPr>
           <w:p>
             <w:pPr>
@@ -5111,7 +4726,7 @@
         </w:trPr>
         <w:tc>
           <w:tcPr>
-            <w:tcW w:w="1700" w:type="dxa"/>
+            <w:tcW w:w="3000" w:type="dxa"/>
           </w:tcPr>
           <w:p>
             <w:pPr>
@@ -5126,13 +4741,13 @@
               <w:rPr>
                 <w:sz w:val="24"/>
               </w:rPr>
-              <w:t>Mean VPE (m)</w:t>
+              <w:t>2D RMS difference (m)</w:t>
             </w:r>
           </w:p>
         </w:tc>
         <w:tc>
           <w:tcPr>
-            <w:tcW w:w="1386" w:type="dxa"/>
+            <w:tcW w:w="2000" w:type="dxa"/>
           </w:tcPr>
           <w:p>
             <w:pPr>
@@ -5154,7 +4769,7 @@
         </w:tc>
         <w:tc>
           <w:tcPr>
-            <w:tcW w:w="1152" w:type="dxa"/>
+            <w:tcW w:w="2000" w:type="dxa"/>
           </w:tcPr>
           <w:p>
             <w:pPr>
@@ -5181,7 +4796,7 @@
         </w:trPr>
         <w:tc>
           <w:tcPr>
-            <w:tcW w:w="1700" w:type="dxa"/>
+            <w:tcW w:w="3000" w:type="dxa"/>
             <w:tcBorders>
               <w:bottom w:val="single" w:sz="8" w:space="0" w:color="000000"/>
             </w:tcBorders>
@@ -5199,13 +4814,13 @@
               <w:rPr>
                 <w:sz w:val="24"/>
               </w:rPr>
-              <w:t>Std VPE (m)</w:t>
+              <w:t>Epochs compared</w:t>
             </w:r>
           </w:p>
         </w:tc>
         <w:tc>
           <w:tcPr>
-            <w:tcW w:w="1386" w:type="dxa"/>
+            <w:tcW w:w="2000" w:type="dxa"/>
             <w:tcBorders>
               <w:bottom w:val="single" w:sz="8" w:space="0" w:color="000000"/>
             </w:tcBorders>
@@ -5230,7 +4845,7 @@
         </w:tc>
         <w:tc>
           <w:tcPr>
-            <w:tcW w:w="1152" w:type="dxa"/>
+            <w:tcW w:w="2000" w:type="dxa"/>
             <w:tcBorders>
               <w:bottom w:val="single" w:sz="8" w:space="0" w:color="000000"/>
             </w:tcBorders>
@@ -5255,6 +4870,778 @@
         </w:tc>
       </w:tr>
     </w:tbl>
+    <w:p>
+      <w:pPr>
+        <w:pStyle w:val="a3"/>
+        <w:spacing w:before="3" w:line="288" w:lineRule="auto"/>
+        <w:rPr>
+          <w:sz w:val="38"/>
+        </w:rPr>
+      </w:pPr>
+    </w:p>
+    <w:p>
+      <w:pPr>
+        <w:pStyle w:val="1"/>
+        <w:numPr>
+          <w:ilvl w:val="0"/>
+          <w:numId w:val="1"/>
+        </w:numPr>
+        <w:spacing w:after="358" w:line="288" w:lineRule="auto"/>
+        <w:rPr>
+          <w:color w:val="000000"/>
+        </w:rPr>
+      </w:pPr>
+      <w:bookmarkStart w:id="7" w:name="Results_and_Discussion"/>
+      <w:bookmarkEnd w:id="7"/>
+      <w:r>
+        <w:rPr>
+          <w:color w:val="000000"/>
+        </w:rPr>
+        <w:t>Benchmark Results</w:t>
+      </w:r>
+    </w:p>
+    <w:p>
+      <w:pPr>
+        <w:pStyle w:val="a3"/>
+        <w:spacing w:before="358" w:line="288" w:lineRule="auto"/>
+        <w:ind w:left="423" w:right="97"/>
+      </w:pPr>
+      <w:r>
+        <w:t>Report each technique you tried on the UrbanNav benchmark, why you tried it and its measured effect, one change at a time (ablation table). Check every version on the example dataset first.</w:t>
+      </w:r>
+    </w:p>
+    <w:p>
+      <w:pPr>
+        <w:keepNext/>
+        <w:spacing w:before="263" w:line="288" w:lineRule="auto"/>
+        <w:ind w:left="2089" w:right="1769"/>
+        <w:jc w:val="center"/>
+      </w:pPr>
+      <w:r>
+        <w:rPr>
+          <w:b/>
+        </w:rPr>
+        <w:t>Table 3: Ablation on the benchmark dataset (example format).</w:t>
+      </w:r>
+    </w:p>
+    <w:tbl>
+      <w:tblPr>
+        <w:tblW w:w="0" w:type="auto"/>
+        <w:jc w:val="center"/>
+        <w:tblLayout w:type="fixed"/>
+        <w:tblCellMar>
+          <w:left w:w="0" w:type="dxa"/>
+          <w:right w:w="0" w:type="dxa"/>
+        </w:tblCellMar>
+        <w:tblLook w:val="04A0" w:firstRow="1" w:lastRow="0" w:firstColumn="1" w:lastColumn="0" w:noHBand="0" w:noVBand="1"/>
+      </w:tblPr>
+      <w:tblGrid>
+        <w:gridCol w:w="900"/>
+        <w:gridCol w:w="2900"/>
+        <w:gridCol w:w="1600"/>
+        <w:gridCol w:w="1600"/>
+        <w:gridCol w:w="1600"/>
+      </w:tblGrid>
+      <w:tr>
+        <w:trPr>
+          <w:trHeight w:val="394"/>
+        </w:trPr>
+        <w:tc>
+          <w:tcPr>
+            <w:tcW w:w="900" w:type="dxa"/>
+            <w:tcBorders>
+              <w:top w:val="single" w:sz="8" w:space="0" w:color="000000"/>
+              <w:bottom w:val="single" w:sz="6" w:space="0" w:color="000000"/>
+            </w:tcBorders>
+          </w:tcPr>
+          <w:p>
+            <w:pPr>
+              <w:pStyle w:val="TableParagraph"/>
+              <w:keepNext/>
+              <w:spacing w:before="44" w:line="288" w:lineRule="auto"/>
+              <w:ind w:left="119"/>
+              <w:rPr>
+                <w:sz w:val="24"/>
+              </w:rPr>
+            </w:pPr>
+            <w:r>
+              <w:rPr>
+                <w:sz w:val="24"/>
+              </w:rPr>
+              <w:t>Version</w:t>
+            </w:r>
+          </w:p>
+        </w:tc>
+        <w:tc>
+          <w:tcPr>
+            <w:tcW w:w="2900" w:type="dxa"/>
+            <w:tcBorders>
+              <w:top w:val="single" w:sz="8" w:space="0" w:color="000000"/>
+              <w:bottom w:val="single" w:sz="6" w:space="0" w:color="000000"/>
+            </w:tcBorders>
+          </w:tcPr>
+          <w:p>
+            <w:pPr>
+              <w:pStyle w:val="TableParagraph"/>
+              <w:keepNext/>
+              <w:spacing w:before="44" w:line="288" w:lineRule="auto"/>
+              <w:ind w:left="86" w:right="86"/>
+              <w:jc w:val="center"/>
+              <w:rPr>
+                <w:sz w:val="24"/>
+              </w:rPr>
+            </w:pPr>
+            <w:r>
+              <w:rPr>
+                <w:sz w:val="24"/>
+              </w:rPr>
+              <w:t>Change tested</w:t>
+            </w:r>
+          </w:p>
+        </w:tc>
+        <w:tc>
+          <w:tcPr>
+            <w:tcW w:w="1600" w:type="dxa"/>
+            <w:tcBorders>
+              <w:top w:val="single" w:sz="8" w:space="0" w:color="000000"/>
+              <w:bottom w:val="single" w:sz="6" w:space="0" w:color="000000"/>
+            </w:tcBorders>
+          </w:tcPr>
+          <w:p>
+            <w:pPr>
+              <w:pStyle w:val="TableParagraph"/>
+              <w:keepNext/>
+              <w:spacing w:before="44" w:line="288" w:lineRule="auto"/>
+              <w:ind w:left="89" w:right="89"/>
+              <w:jc w:val="center"/>
+              <w:rPr>
+                <w:sz w:val="24"/>
+              </w:rPr>
+            </w:pPr>
+            <w:r>
+              <w:rPr>
+                <w:sz w:val="24"/>
+              </w:rPr>
+              <w:t>2D RMSE (m)</w:t>
+            </w:r>
+          </w:p>
+        </w:tc>
+        <w:tc>
+          <w:tcPr>
+            <w:tcW w:w="1600" w:type="dxa"/>
+            <w:tcBorders>
+              <w:top w:val="single" w:sz="8" w:space="0" w:color="000000"/>
+              <w:bottom w:val="single" w:sz="6" w:space="0" w:color="000000"/>
+            </w:tcBorders>
+          </w:tcPr>
+          <w:p>
+            <w:pPr>
+              <w:pStyle w:val="TableParagraph"/>
+              <w:keepNext/>
+              <w:spacing w:before="44" w:line="288" w:lineRule="auto"/>
+              <w:ind w:left="89" w:right="89"/>
+              <w:jc w:val="center"/>
+              <w:rPr>
+                <w:sz w:val="24"/>
+              </w:rPr>
+            </w:pPr>
+            <w:r>
+              <w:rPr>
+                <w:sz w:val="24"/>
+              </w:rPr>
+              <w:t>3D RMSE (m)</w:t>
+            </w:r>
+          </w:p>
+        </w:tc>
+        <w:tc>
+          <w:tcPr>
+            <w:tcW w:w="1600" w:type="dxa"/>
+            <w:tcBorders>
+              <w:top w:val="single" w:sz="8" w:space="0" w:color="000000"/>
+              <w:bottom w:val="single" w:sz="6" w:space="0" w:color="000000"/>
+            </w:tcBorders>
+          </w:tcPr>
+          <w:p>
+            <w:pPr>
+              <w:pStyle w:val="TableParagraph"/>
+              <w:keepNext/>
+              <w:spacing w:before="44" w:line="288" w:lineRule="auto"/>
+              <w:ind w:left="89" w:right="89"/>
+              <w:jc w:val="center"/>
+              <w:rPr>
+                <w:sz w:val="24"/>
+              </w:rPr>
+            </w:pPr>
+            <w:r>
+              <w:rPr>
+                <w:sz w:val="24"/>
+              </w:rPr>
+              <w:t>Availability (%)</w:t>
+            </w:r>
+          </w:p>
+        </w:tc>
+      </w:tr>
+      <w:tr>
+        <w:trPr>
+          <w:trHeight w:val="319"/>
+        </w:trPr>
+        <w:tc>
+          <w:tcPr>
+            <w:tcW w:w="900" w:type="dxa"/>
+            <w:tcBorders>
+              <w:top w:val="single" w:sz="6" w:space="0" w:color="000000"/>
+            </w:tcBorders>
+          </w:tcPr>
+          <w:p>
+            <w:pPr>
+              <w:pStyle w:val="TableParagraph"/>
+              <w:keepNext/>
+              <w:spacing w:before="43" w:line="288" w:lineRule="auto"/>
+              <w:ind w:left="119"/>
+              <w:rPr>
+                <w:sz w:val="24"/>
+              </w:rPr>
+            </w:pPr>
+            <w:r>
+              <w:rPr>
+                <w:sz w:val="24"/>
+              </w:rPr>
+              <w:t>v1</w:t>
+            </w:r>
+          </w:p>
+        </w:tc>
+        <w:tc>
+          <w:tcPr>
+            <w:tcW w:w="2900" w:type="dxa"/>
+            <w:tcBorders>
+              <w:top w:val="single" w:sz="6" w:space="0" w:color="000000"/>
+            </w:tcBorders>
+          </w:tcPr>
+          <w:p>
+            <w:pPr>
+              <w:pStyle w:val="TableParagraph"/>
+              <w:keepNext/>
+              <w:spacing w:before="43" w:line="288" w:lineRule="auto"/>
+              <w:jc w:val="center"/>
+              <w:rPr>
+                <w:sz w:val="24"/>
+              </w:rPr>
+            </w:pPr>
+            <w:r>
+              <w:rPr>
+                <w:w w:val="99"/>
+                <w:sz w:val="24"/>
+              </w:rPr>
+              <w:t>GPS-only baseline</w:t>
+            </w:r>
+          </w:p>
+        </w:tc>
+        <w:tc>
+          <w:tcPr>
+            <w:tcW w:w="1600" w:type="dxa"/>
+            <w:tcBorders>
+              <w:top w:val="single" w:sz="6" w:space="0" w:color="000000"/>
+            </w:tcBorders>
+          </w:tcPr>
+          <w:p>
+            <w:pPr>
+              <w:pStyle w:val="TableParagraph"/>
+              <w:keepNext/>
+              <w:spacing w:before="43" w:line="288" w:lineRule="auto"/>
+              <w:jc w:val="center"/>
+              <w:rPr>
+                <w:sz w:val="24"/>
+              </w:rPr>
+            </w:pPr>
+            <w:r>
+              <w:rPr>
+                <w:w w:val="99"/>
+                <w:sz w:val="24"/>
+              </w:rPr>
+              <w:t>–</w:t>
+            </w:r>
+          </w:p>
+        </w:tc>
+        <w:tc>
+          <w:tcPr>
+            <w:tcW w:w="1600" w:type="dxa"/>
+            <w:tcBorders>
+              <w:top w:val="single" w:sz="6" w:space="0" w:color="000000"/>
+            </w:tcBorders>
+          </w:tcPr>
+          <w:p>
+            <w:pPr>
+              <w:pStyle w:val="TableParagraph"/>
+              <w:keepNext/>
+              <w:spacing w:before="43" w:line="288" w:lineRule="auto"/>
+              <w:jc w:val="center"/>
+              <w:rPr>
+                <w:sz w:val="24"/>
+              </w:rPr>
+            </w:pPr>
+            <w:r>
+              <w:rPr>
+                <w:w w:val="99"/>
+                <w:sz w:val="24"/>
+              </w:rPr>
+              <w:t>–</w:t>
+            </w:r>
+          </w:p>
+        </w:tc>
+        <w:tc>
+          <w:tcPr>
+            <w:tcW w:w="1600" w:type="dxa"/>
+            <w:tcBorders>
+              <w:top w:val="single" w:sz="6" w:space="0" w:color="000000"/>
+            </w:tcBorders>
+          </w:tcPr>
+          <w:p>
+            <w:pPr>
+              <w:pStyle w:val="TableParagraph"/>
+              <w:keepNext/>
+              <w:spacing w:before="43" w:line="288" w:lineRule="auto"/>
+              <w:jc w:val="center"/>
+              <w:rPr>
+                <w:sz w:val="24"/>
+              </w:rPr>
+            </w:pPr>
+            <w:r>
+              <w:rPr>
+                <w:w w:val="99"/>
+                <w:sz w:val="24"/>
+              </w:rPr>
+              <w:t>–</w:t>
+            </w:r>
+          </w:p>
+        </w:tc>
+      </w:tr>
+      <w:tr>
+        <w:trPr>
+          <w:trHeight w:val="288"/>
+        </w:trPr>
+        <w:tc>
+          <w:tcPr>
+            <w:tcW w:w="900" w:type="dxa"/>
+          </w:tcPr>
+          <w:p>
+            <w:pPr>
+              <w:pStyle w:val="TableParagraph"/>
+              <w:keepNext/>
+              <w:spacing w:line="288" w:lineRule="auto"/>
+              <w:ind w:left="119"/>
+              <w:rPr>
+                <w:sz w:val="24"/>
+              </w:rPr>
+            </w:pPr>
+            <w:r>
+              <w:rPr>
+                <w:sz w:val="24"/>
+              </w:rPr>
+              <w:t>v2</w:t>
+            </w:r>
+          </w:p>
+        </w:tc>
+        <w:tc>
+          <w:tcPr>
+            <w:tcW w:w="2900" w:type="dxa"/>
+          </w:tcPr>
+          <w:p>
+            <w:pPr>
+              <w:pStyle w:val="TableParagraph"/>
+              <w:keepNext/>
+              <w:spacing w:line="288" w:lineRule="auto"/>
+              <w:jc w:val="center"/>
+              <w:rPr>
+                <w:sz w:val="24"/>
+              </w:rPr>
+            </w:pPr>
+            <w:r>
+              <w:rPr>
+                <w:w w:val="99"/>
+                <w:sz w:val="24"/>
+              </w:rPr>
+              <w:t>+ BeiDou and Galileo</w:t>
+            </w:r>
+          </w:p>
+        </w:tc>
+        <w:tc>
+          <w:tcPr>
+            <w:tcW w:w="1600" w:type="dxa"/>
+          </w:tcPr>
+          <w:p>
+            <w:pPr>
+              <w:pStyle w:val="TableParagraph"/>
+              <w:keepNext/>
+              <w:spacing w:line="288" w:lineRule="auto"/>
+              <w:jc w:val="center"/>
+              <w:rPr>
+                <w:sz w:val="24"/>
+              </w:rPr>
+            </w:pPr>
+            <w:r>
+              <w:rPr>
+                <w:w w:val="99"/>
+                <w:sz w:val="24"/>
+              </w:rPr>
+              <w:t>–</w:t>
+            </w:r>
+          </w:p>
+        </w:tc>
+        <w:tc>
+          <w:tcPr>
+            <w:tcW w:w="1600" w:type="dxa"/>
+          </w:tcPr>
+          <w:p>
+            <w:pPr>
+              <w:pStyle w:val="TableParagraph"/>
+              <w:keepNext/>
+              <w:spacing w:line="288" w:lineRule="auto"/>
+              <w:jc w:val="center"/>
+              <w:rPr>
+                <w:sz w:val="24"/>
+              </w:rPr>
+            </w:pPr>
+            <w:r>
+              <w:rPr>
+                <w:w w:val="99"/>
+                <w:sz w:val="24"/>
+              </w:rPr>
+              <w:t>–</w:t>
+            </w:r>
+          </w:p>
+        </w:tc>
+        <w:tc>
+          <w:tcPr>
+            <w:tcW w:w="1600" w:type="dxa"/>
+          </w:tcPr>
+          <w:p>
+            <w:pPr>
+              <w:pStyle w:val="TableParagraph"/>
+              <w:keepNext/>
+              <w:spacing w:line="288" w:lineRule="auto"/>
+              <w:jc w:val="center"/>
+              <w:rPr>
+                <w:sz w:val="24"/>
+              </w:rPr>
+            </w:pPr>
+            <w:r>
+              <w:rPr>
+                <w:w w:val="99"/>
+                <w:sz w:val="24"/>
+              </w:rPr>
+              <w:t>–</w:t>
+            </w:r>
+          </w:p>
+        </w:tc>
+      </w:tr>
+      <w:tr>
+        <w:trPr>
+          <w:trHeight w:val="288"/>
+        </w:trPr>
+        <w:tc>
+          <w:tcPr>
+            <w:tcW w:w="900" w:type="dxa"/>
+          </w:tcPr>
+          <w:p>
+            <w:pPr>
+              <w:pStyle w:val="TableParagraph"/>
+              <w:keepNext/>
+              <w:spacing w:line="288" w:lineRule="auto"/>
+              <w:ind w:left="119"/>
+              <w:rPr>
+                <w:sz w:val="24"/>
+              </w:rPr>
+            </w:pPr>
+            <w:r>
+              <w:rPr>
+                <w:sz w:val="24"/>
+              </w:rPr>
+              <w:t>v3</w:t>
+            </w:r>
+          </w:p>
+        </w:tc>
+        <w:tc>
+          <w:tcPr>
+            <w:tcW w:w="2900" w:type="dxa"/>
+          </w:tcPr>
+          <w:p>
+            <w:pPr>
+              <w:pStyle w:val="TableParagraph"/>
+              <w:keepNext/>
+              <w:spacing w:line="288" w:lineRule="auto"/>
+              <w:jc w:val="center"/>
+              <w:rPr>
+                <w:sz w:val="24"/>
+              </w:rPr>
+            </w:pPr>
+            <w:r>
+              <w:rPr>
+                <w:w w:val="99"/>
+                <w:sz w:val="24"/>
+              </w:rPr>
+              <w:t>+ C/N0 weighting</w:t>
+            </w:r>
+          </w:p>
+        </w:tc>
+        <w:tc>
+          <w:tcPr>
+            <w:tcW w:w="1600" w:type="dxa"/>
+          </w:tcPr>
+          <w:p>
+            <w:pPr>
+              <w:pStyle w:val="TableParagraph"/>
+              <w:keepNext/>
+              <w:spacing w:line="288" w:lineRule="auto"/>
+              <w:jc w:val="center"/>
+              <w:rPr>
+                <w:sz w:val="24"/>
+              </w:rPr>
+            </w:pPr>
+            <w:r>
+              <w:rPr>
+                <w:w w:val="99"/>
+                <w:sz w:val="24"/>
+              </w:rPr>
+              <w:t>–</w:t>
+            </w:r>
+          </w:p>
+        </w:tc>
+        <w:tc>
+          <w:tcPr>
+            <w:tcW w:w="1600" w:type="dxa"/>
+          </w:tcPr>
+          <w:p>
+            <w:pPr>
+              <w:pStyle w:val="TableParagraph"/>
+              <w:keepNext/>
+              <w:spacing w:line="288" w:lineRule="auto"/>
+              <w:jc w:val="center"/>
+              <w:rPr>
+                <w:sz w:val="24"/>
+              </w:rPr>
+            </w:pPr>
+            <w:r>
+              <w:rPr>
+                <w:w w:val="99"/>
+                <w:sz w:val="24"/>
+              </w:rPr>
+              <w:t>–</w:t>
+            </w:r>
+          </w:p>
+        </w:tc>
+        <w:tc>
+          <w:tcPr>
+            <w:tcW w:w="1600" w:type="dxa"/>
+          </w:tcPr>
+          <w:p>
+            <w:pPr>
+              <w:pStyle w:val="TableParagraph"/>
+              <w:keepNext/>
+              <w:spacing w:line="288" w:lineRule="auto"/>
+              <w:jc w:val="center"/>
+              <w:rPr>
+                <w:sz w:val="24"/>
+              </w:rPr>
+            </w:pPr>
+            <w:r>
+              <w:rPr>
+                <w:w w:val="99"/>
+                <w:sz w:val="24"/>
+              </w:rPr>
+              <w:t>–</w:t>
+            </w:r>
+          </w:p>
+        </w:tc>
+      </w:tr>
+      <w:tr>
+        <w:trPr>
+          <w:trHeight w:val="364"/>
+        </w:trPr>
+        <w:tc>
+          <w:tcPr>
+            <w:tcW w:w="900" w:type="dxa"/>
+            <w:tcBorders>
+              <w:bottom w:val="single" w:sz="8" w:space="0" w:color="000000"/>
+            </w:tcBorders>
+          </w:tcPr>
+          <w:p>
+            <w:pPr>
+              <w:pStyle w:val="TableParagraph"/>
+              <w:spacing w:line="288" w:lineRule="auto"/>
+              <w:ind w:left="119"/>
+              <w:rPr>
+                <w:sz w:val="24"/>
+              </w:rPr>
+            </w:pPr>
+            <w:r>
+              <w:rPr>
+                <w:sz w:val="24"/>
+              </w:rPr>
+              <w:t>v4</w:t>
+            </w:r>
+          </w:p>
+        </w:tc>
+        <w:tc>
+          <w:tcPr>
+            <w:tcW w:w="2900" w:type="dxa"/>
+            <w:tcBorders>
+              <w:bottom w:val="single" w:sz="8" w:space="0" w:color="000000"/>
+            </w:tcBorders>
+          </w:tcPr>
+          <w:p>
+            <w:pPr>
+              <w:pStyle w:val="TableParagraph"/>
+              <w:spacing w:line="288" w:lineRule="auto"/>
+              <w:jc w:val="center"/>
+              <w:rPr>
+                <w:sz w:val="24"/>
+              </w:rPr>
+            </w:pPr>
+            <w:r>
+              <w:rPr>
+                <w:w w:val="99"/>
+                <w:sz w:val="24"/>
+              </w:rPr>
+              <w:t>+ outlier rejection</w:t>
+            </w:r>
+          </w:p>
+        </w:tc>
+        <w:tc>
+          <w:tcPr>
+            <w:tcW w:w="1600" w:type="dxa"/>
+            <w:tcBorders>
+              <w:bottom w:val="single" w:sz="8" w:space="0" w:color="000000"/>
+            </w:tcBorders>
+          </w:tcPr>
+          <w:p>
+            <w:pPr>
+              <w:pStyle w:val="TableParagraph"/>
+              <w:spacing w:line="288" w:lineRule="auto"/>
+              <w:jc w:val="center"/>
+              <w:rPr>
+                <w:sz w:val="24"/>
+              </w:rPr>
+            </w:pPr>
+            <w:r>
+              <w:rPr>
+                <w:w w:val="99"/>
+                <w:sz w:val="24"/>
+              </w:rPr>
+              <w:t>–</w:t>
+            </w:r>
+          </w:p>
+        </w:tc>
+        <w:tc>
+          <w:tcPr>
+            <w:tcW w:w="1600" w:type="dxa"/>
+            <w:tcBorders>
+              <w:bottom w:val="single" w:sz="8" w:space="0" w:color="000000"/>
+            </w:tcBorders>
+          </w:tcPr>
+          <w:p>
+            <w:pPr>
+              <w:pStyle w:val="TableParagraph"/>
+              <w:spacing w:line="288" w:lineRule="auto"/>
+              <w:jc w:val="center"/>
+              <w:rPr>
+                <w:sz w:val="24"/>
+              </w:rPr>
+            </w:pPr>
+            <w:r>
+              <w:rPr>
+                <w:w w:val="99"/>
+                <w:sz w:val="24"/>
+              </w:rPr>
+              <w:t>–</w:t>
+            </w:r>
+          </w:p>
+        </w:tc>
+        <w:tc>
+          <w:tcPr>
+            <w:tcW w:w="1600" w:type="dxa"/>
+            <w:tcBorders>
+              <w:bottom w:val="single" w:sz="8" w:space="0" w:color="000000"/>
+            </w:tcBorders>
+          </w:tcPr>
+          <w:p>
+            <w:pPr>
+              <w:pStyle w:val="TableParagraph"/>
+              <w:spacing w:line="288" w:lineRule="auto"/>
+              <w:jc w:val="center"/>
+              <w:rPr>
+                <w:sz w:val="24"/>
+              </w:rPr>
+            </w:pPr>
+            <w:r>
+              <w:rPr>
+                <w:w w:val="99"/>
+                <w:sz w:val="24"/>
+              </w:rPr>
+              <w:t>–</w:t>
+            </w:r>
+          </w:p>
+        </w:tc>
+      </w:tr>
+    </w:tbl>
+    <w:p>
+      <w:pPr>
+        <w:pStyle w:val="a3"/>
+        <w:spacing w:before="3" w:line="288" w:lineRule="auto"/>
+        <w:rPr>
+          <w:sz w:val="38"/>
+        </w:rPr>
+      </w:pPr>
+    </w:p>
+    <w:p>
+      <w:pPr>
+        <w:pStyle w:val="a3"/>
+        <w:spacing w:before="358" w:line="288" w:lineRule="auto"/>
+        <w:ind w:left="423" w:right="97"/>
+      </w:pPr>
+      <w:r>
+        <w:t>Give the final 2D and 3D RMSE, the 95th-percentile 2D error, the availability and the leaderboard rank, and discuss the urban effects (multipath, NLOS reception, satellite geometry).</w:t>
+      </w:r>
+    </w:p>
+    <w:p>
+      <w:pPr>
+        <w:pStyle w:val="a3"/>
+        <w:spacing w:before="3" w:line="288" w:lineRule="auto"/>
+        <w:rPr>
+          <w:sz w:val="38"/>
+        </w:rPr>
+      </w:pPr>
+    </w:p>
+    <w:p>
+      <w:pPr>
+        <w:pStyle w:val="1"/>
+        <w:numPr>
+          <w:ilvl w:val="0"/>
+          <w:numId w:val="1"/>
+        </w:numPr>
+        <w:spacing w:after="358" w:line="288" w:lineRule="auto"/>
+        <w:rPr>
+          <w:color w:val="000000"/>
+        </w:rPr>
+      </w:pPr>
+      <w:bookmarkStart w:id="7" w:name="Results_and_Discussion"/>
+      <w:bookmarkEnd w:id="7"/>
+      <w:r>
+        <w:rPr>
+          <w:color w:val="000000"/>
+        </w:rPr>
+        <w:t>AI-Use Statement</w:t>
+      </w:r>
+    </w:p>
+    <w:p>
+      <w:pPr>
+        <w:pStyle w:val="a3"/>
+        <w:spacing w:before="358" w:line="288" w:lineRule="auto"/>
+        <w:ind w:left="423" w:right="97"/>
+      </w:pPr>
+      <w:r>
+        <w:t>State which AI tools you used, for what purpose, and how you verified their output (for example on the example dataset). List the key prompts in Appendix B.</w:t>
+      </w:r>
+    </w:p>
     <w:p>
       <w:pPr>
         <w:pStyle w:val="a3"/>
@@ -5348,20 +5735,7 @@
         <w:rPr>
           <w:sz w:val="24"/>
         </w:rPr>
-        <w:t xml:space="preserve">GitHub repository must include: </w:t>
-      </w:r>
-      <w:r>
-        <w:rPr>
-          <w:spacing w:val="-3"/>
-          <w:sz w:val="24"/>
-        </w:rPr>
-        <w:t xml:space="preserve">raw </w:t>
-      </w:r>
-      <w:r>
-        <w:rPr>
-          <w:sz w:val="24"/>
-        </w:rPr>
-        <w:t>data, PDF report, Python scripts (documented), and README.md.</w:t>
+        <w:t>GitHub repository: raw data, documented Python scripts and README.md; it must reproduce both submitted CSV files.</w:t>
       </w:r>
     </w:p>
     <w:p>
@@ -5384,252 +5758,7 @@
         <w:rPr>
           <w:sz w:val="24"/>
         </w:rPr>
-        <w:t>Submit the repository link to the lecturer and</w:t>
-      </w:r>
-      <w:r>
-        <w:rPr>
-          <w:spacing w:val="-9"/>
-          <w:sz w:val="24"/>
-        </w:rPr>
-        <w:t xml:space="preserve"> </w:t>
-      </w:r>
-      <w:r>
-        <w:rPr>
-          <w:spacing w:val="-4"/>
-          <w:sz w:val="24"/>
-        </w:rPr>
-        <w:t>TAs.</w:t>
-      </w:r>
-    </w:p>
-    <w:p>
-      <w:pPr>
-        <w:pStyle w:val="a3"/>
-        <w:spacing w:before="83" w:line="288" w:lineRule="auto"/>
-        <w:ind w:left="423"/>
-      </w:pPr>
-      <w:r>
-        <w:t xml:space="preserve">- </w:t>
-      </w:r>
-      <w:r>
-        <w:t>Deadline: announced on Blackboard.</w:t>
-      </w:r>
-    </w:p>
-    <w:p>
-      <w:pPr>
-        <w:pStyle w:val="a3"/>
-        <w:spacing w:before="10" w:line="288" w:lineRule="auto"/>
-        <w:rPr>
-          <w:sz w:val="46"/>
-        </w:rPr>
-      </w:pPr>
-    </w:p>
-    <w:p>
-      <w:pPr>
-        <w:pStyle w:val="1"/>
-        <w:spacing w:after="358" w:line="288" w:lineRule="auto"/>
-        <w:ind w:left="425" w:firstLine="0"/>
-        <w:rPr>
-          <w:color w:val="000000"/>
-        </w:rPr>
-      </w:pPr>
-      <w:r>
-        <w:rPr>
-          <w:color w:val="000000"/>
-        </w:rPr>
-        <w:t>Objectives</w:t>
-      </w:r>
-    </w:p>
-    <w:p>
-      <w:pPr>
-        <w:pStyle w:val="a8"/>
-        <w:numPr>
-          <w:ilvl w:val="0"/>
-          <w:numId w:val="2"/>
-        </w:numPr>
-        <w:tabs>
-          <w:tab w:val="left" w:pos="555"/>
-        </w:tabs>
-        <w:spacing w:before="357" w:line="288" w:lineRule="auto"/>
-        <w:ind w:left="554" w:hanging="132"/>
-        <w:rPr>
-          <w:sz w:val="24"/>
-        </w:rPr>
-      </w:pPr>
-      <w:r>
-        <w:rPr>
-          <w:sz w:val="24"/>
-        </w:rPr>
-        <w:t>Summarize</w:t>
-      </w:r>
-      <w:r>
-        <w:rPr>
-          <w:spacing w:val="-12"/>
-          <w:sz w:val="24"/>
-        </w:rPr>
-        <w:t xml:space="preserve"> </w:t>
-      </w:r>
-      <w:r>
-        <w:rPr>
-          <w:sz w:val="24"/>
-        </w:rPr>
-        <w:t>data</w:t>
-      </w:r>
-      <w:r>
-        <w:rPr>
-          <w:spacing w:val="-12"/>
-          <w:sz w:val="24"/>
-        </w:rPr>
-        <w:t xml:space="preserve"> </w:t>
-      </w:r>
-      <w:r>
-        <w:rPr>
-          <w:sz w:val="24"/>
-        </w:rPr>
-        <w:t>collection</w:t>
-      </w:r>
-      <w:r>
-        <w:rPr>
-          <w:spacing w:val="-11"/>
-          <w:sz w:val="24"/>
-        </w:rPr>
-        <w:t xml:space="preserve"> </w:t>
-      </w:r>
-      <w:r>
-        <w:rPr>
-          <w:sz w:val="24"/>
-        </w:rPr>
-        <w:t>near</w:t>
-      </w:r>
-      <w:r>
-        <w:rPr>
-          <w:spacing w:val="-12"/>
-          <w:sz w:val="24"/>
-        </w:rPr>
-        <w:t xml:space="preserve"> </w:t>
-      </w:r>
-      <w:r>
-        <w:rPr>
-          <w:sz w:val="24"/>
-        </w:rPr>
-        <w:t>Block</w:t>
-      </w:r>
-      <w:r>
-        <w:rPr>
-          <w:spacing w:val="-12"/>
-          <w:sz w:val="24"/>
-        </w:rPr>
-        <w:t xml:space="preserve"> </w:t>
-      </w:r>
-      <w:r>
-        <w:rPr>
-          <w:sz w:val="24"/>
-        </w:rPr>
-        <w:t>X.</w:t>
-      </w:r>
-      <w:r>
-        <w:rPr>
-          <w:spacing w:val="-11"/>
-          <w:sz w:val="24"/>
-        </w:rPr>
-        <w:t xml:space="preserve"> </w:t>
-      </w:r>
-      <w:r>
-        <w:rPr>
-          <w:sz w:val="24"/>
-        </w:rPr>
-        <w:t>-</w:t>
-      </w:r>
-      <w:r>
-        <w:rPr>
-          <w:spacing w:val="-12"/>
-          <w:sz w:val="24"/>
-        </w:rPr>
-        <w:t xml:space="preserve"> </w:t>
-      </w:r>
-      <w:r>
-        <w:rPr>
-          <w:sz w:val="24"/>
-        </w:rPr>
-        <w:t>Provide</w:t>
-      </w:r>
-      <w:r>
-        <w:rPr>
-          <w:spacing w:val="-11"/>
-          <w:sz w:val="24"/>
-        </w:rPr>
-        <w:t xml:space="preserve"> </w:t>
-      </w:r>
-      <w:r>
-        <w:rPr>
-          <w:spacing w:val="-3"/>
-          <w:sz w:val="24"/>
-        </w:rPr>
-        <w:t>raw</w:t>
-      </w:r>
-      <w:r>
-        <w:rPr>
-          <w:spacing w:val="-12"/>
-          <w:sz w:val="24"/>
-        </w:rPr>
-        <w:t xml:space="preserve"> </w:t>
-      </w:r>
-      <w:r>
-        <w:rPr>
-          <w:sz w:val="24"/>
-        </w:rPr>
-        <w:t>data</w:t>
-      </w:r>
-      <w:r>
-        <w:rPr>
-          <w:spacing w:val="-12"/>
-          <w:sz w:val="24"/>
-        </w:rPr>
-        <w:t xml:space="preserve"> </w:t>
-      </w:r>
-      <w:r>
-        <w:rPr>
-          <w:sz w:val="24"/>
-        </w:rPr>
-        <w:t>indicators</w:t>
-      </w:r>
-      <w:r>
-        <w:rPr>
-          <w:spacing w:val="-11"/>
-          <w:sz w:val="24"/>
-        </w:rPr>
-        <w:t xml:space="preserve"> </w:t>
-      </w:r>
-      <w:r>
-        <w:rPr>
-          <w:sz w:val="24"/>
-        </w:rPr>
-        <w:t>(satellites,</w:t>
-      </w:r>
-      <w:r>
-        <w:rPr>
-          <w:spacing w:val="-11"/>
-          <w:sz w:val="24"/>
-        </w:rPr>
-        <w:t xml:space="preserve"> </w:t>
-      </w:r>
-      <w:r>
-        <w:rPr>
-          <w:sz w:val="24"/>
-        </w:rPr>
-        <w:t>C/N0,</w:t>
-      </w:r>
-      <w:r>
-        <w:rPr>
-          <w:spacing w:val="-10"/>
-          <w:sz w:val="24"/>
-        </w:rPr>
-        <w:t xml:space="preserve"> </w:t>
-      </w:r>
-      <w:r>
-        <w:rPr>
-          <w:sz w:val="24"/>
-        </w:rPr>
-        <w:t>GDOP).</w:t>
+        <w:t>Submit the PDF report on Blackboard and give the GitHub link in the report; upload GXX_benchmark.csv and GXX_owndata.csv to the TA's Google Drive folder.</w:t>
       </w:r>
     </w:p>
     <w:p>
@@ -5642,317 +5771,22 @@
         <w:tabs>
           <w:tab w:val="left" w:pos="564"/>
         </w:tabs>
-        <w:spacing w:before="83" w:line="288" w:lineRule="auto"/>
+        <w:spacing w:line="288" w:lineRule="auto"/>
         <w:ind w:left="563" w:hanging="141"/>
         <w:rPr>
           <w:sz w:val="24"/>
         </w:rPr>
       </w:pPr>
       <w:r>
-        <w:rPr>
-          <w:sz w:val="24"/>
-        </w:rPr>
-        <w:t>Implement SPP; optionally design weights. - Present results and concise</w:t>
-      </w:r>
-      <w:r>
-        <w:rPr>
-          <w:spacing w:val="3"/>
-          <w:sz w:val="24"/>
-        </w:rPr>
-        <w:t xml:space="preserve"> </w:t>
-      </w:r>
-      <w:r>
-        <w:rPr>
-          <w:sz w:val="24"/>
-        </w:rPr>
-        <w:t>discussion.</w:t>
-      </w:r>
-    </w:p>
-    <w:p>
-      <w:pPr>
-        <w:spacing w:line="288" w:lineRule="auto"/>
-        <w:rPr>
-          <w:sz w:val="24"/>
-        </w:rPr>
-        <w:sectPr>
-          <w:pgSz w:w="11910" w:h="16840"/>
-          <w:pgMar w:top="1220" w:right="1200" w:bottom="1340" w:left="880" w:header="777" w:footer="1070" w:gutter="0"/>
-          <w:cols w:space="720"/>
-        </w:sectPr>
-      </w:pPr>
-    </w:p>
-    <w:p>
-      <w:pPr>
-        <w:pStyle w:val="1"/>
-        <w:spacing w:after="358" w:line="288" w:lineRule="auto"/>
-        <w:ind w:left="425" w:firstLine="0"/>
-        <w:rPr>
-          <w:color w:val="000000"/>
-        </w:rPr>
-      </w:pPr>
-      <w:r>
-        <w:rPr>
-          <w:color w:val="000000"/>
-        </w:rPr>
-        <w:t>Materials and Apparatus</w:t>
-      </w:r>
-    </w:p>
-    <w:p>
-      <w:pPr>
-        <w:pStyle w:val="a8"/>
-        <w:numPr>
-          <w:ilvl w:val="0"/>
-          <w:numId w:val="2"/>
-        </w:numPr>
-        <w:tabs>
-          <w:tab w:val="left" w:pos="571"/>
-        </w:tabs>
-        <w:spacing w:line="288" w:lineRule="auto"/>
-        <w:ind w:left="425" w:right="102" w:firstLine="0"/>
-        <w:rPr>
-          <w:sz w:val="24"/>
-        </w:rPr>
-      </w:pPr>
-      <w:r>
-        <w:rPr>
-          <w:sz w:val="24"/>
-        </w:rPr>
-        <w:t xml:space="preserve">GNSS receiver with suitable antenna and mount. - Laptop with logging software; Python 3 </w:t>
-      </w:r>
-      <w:r>
-        <w:rPr>
-          <w:spacing w:val="-9"/>
-          <w:sz w:val="24"/>
-        </w:rPr>
-        <w:t xml:space="preserve">for </w:t>
-      </w:r>
-      <w:r>
-        <w:rPr>
-          <w:sz w:val="24"/>
-        </w:rPr>
-        <w:t>processing.</w:t>
+        <w:t>Deadline: announced on Blackboard.</w:t>
       </w:r>
     </w:p>
     <w:p>
       <w:pPr>
         <w:pStyle w:val="a3"/>
-        <w:spacing w:before="7" w:line="288" w:lineRule="auto"/>
-        <w:rPr>
-          <w:sz w:val="39"/>
-        </w:rPr>
-      </w:pPr>
-    </w:p>
-    <w:p>
-      <w:pPr>
-        <w:pStyle w:val="1"/>
-        <w:spacing w:after="358" w:line="288" w:lineRule="auto"/>
-        <w:ind w:left="425" w:firstLine="0"/>
-      </w:pPr>
-      <w:r>
-        <w:rPr>
-          <w:color w:val="000000"/>
-        </w:rPr>
-        <w:t>Methods</w:t>
-      </w:r>
-    </w:p>
-    <w:p>
-      <w:pPr>
-        <w:pStyle w:val="a8"/>
-        <w:numPr>
-          <w:ilvl w:val="0"/>
-          <w:numId w:val="2"/>
-        </w:numPr>
-        <w:tabs>
-          <w:tab w:val="left" w:pos="542"/>
-        </w:tabs>
-        <w:spacing w:before="358" w:line="288" w:lineRule="auto"/>
-        <w:ind w:left="423" w:right="102" w:firstLine="0"/>
-        <w:rPr>
-          <w:sz w:val="24"/>
-        </w:rPr>
-      </w:pPr>
-      <w:r>
-        <w:rPr>
-          <w:sz w:val="24"/>
-        </w:rPr>
-        <w:t>Log</w:t>
-      </w:r>
-      <w:r>
-        <w:rPr>
-          <w:spacing w:val="-28"/>
-          <w:sz w:val="24"/>
-        </w:rPr>
-        <w:t xml:space="preserve"> </w:t>
-      </w:r>
-      <w:r>
-        <w:rPr>
-          <w:sz w:val="24"/>
-        </w:rPr>
-        <w:t>observations,</w:t>
-      </w:r>
-      <w:r>
-        <w:rPr>
-          <w:spacing w:val="-24"/>
-          <w:sz w:val="24"/>
-        </w:rPr>
-        <w:t xml:space="preserve"> </w:t>
-      </w:r>
-      <w:r>
-        <w:rPr>
-          <w:sz w:val="24"/>
-        </w:rPr>
-        <w:t>convert</w:t>
-      </w:r>
-      <w:r>
-        <w:rPr>
-          <w:spacing w:val="-28"/>
-          <w:sz w:val="24"/>
-        </w:rPr>
-        <w:t xml:space="preserve"> </w:t>
-      </w:r>
-      <w:r>
-        <w:rPr>
-          <w:sz w:val="24"/>
-        </w:rPr>
-        <w:t>to</w:t>
-      </w:r>
-      <w:r>
-        <w:rPr>
-          <w:spacing w:val="-28"/>
-          <w:sz w:val="24"/>
-        </w:rPr>
-        <w:t xml:space="preserve"> </w:t>
-      </w:r>
-      <w:r>
-        <w:rPr>
-          <w:sz w:val="24"/>
-        </w:rPr>
-        <w:t>analysis-ready</w:t>
-      </w:r>
-      <w:r>
-        <w:rPr>
-          <w:spacing w:val="-27"/>
-          <w:sz w:val="24"/>
-        </w:rPr>
-        <w:t xml:space="preserve"> </w:t>
-      </w:r>
-      <w:r>
-        <w:rPr>
-          <w:sz w:val="24"/>
-        </w:rPr>
-        <w:t>format,</w:t>
-      </w:r>
-      <w:r>
-        <w:rPr>
-          <w:spacing w:val="-24"/>
-          <w:sz w:val="24"/>
-        </w:rPr>
-        <w:t xml:space="preserve"> </w:t>
-      </w:r>
-      <w:r>
-        <w:rPr>
-          <w:sz w:val="24"/>
-        </w:rPr>
-        <w:t>compute</w:t>
-      </w:r>
-      <w:r>
-        <w:rPr>
-          <w:spacing w:val="-28"/>
-          <w:sz w:val="24"/>
-        </w:rPr>
-        <w:t xml:space="preserve"> </w:t>
-      </w:r>
-      <w:r>
-        <w:rPr>
-          <w:sz w:val="24"/>
-        </w:rPr>
-        <w:t>indicators.</w:t>
-      </w:r>
-      <w:r>
-        <w:rPr>
-          <w:spacing w:val="6"/>
-          <w:sz w:val="24"/>
-        </w:rPr>
-        <w:t xml:space="preserve"> </w:t>
-      </w:r>
-      <w:r>
-        <w:rPr>
-          <w:sz w:val="24"/>
-        </w:rPr>
-        <w:t>-</w:t>
-      </w:r>
-      <w:r>
-        <w:rPr>
-          <w:spacing w:val="-27"/>
-          <w:sz w:val="24"/>
-        </w:rPr>
-        <w:t xml:space="preserve"> </w:t>
-      </w:r>
-      <w:r>
-        <w:rPr>
-          <w:sz w:val="24"/>
-        </w:rPr>
-        <w:t>Run</w:t>
-      </w:r>
-      <w:r>
-        <w:rPr>
-          <w:spacing w:val="-28"/>
-          <w:sz w:val="24"/>
-        </w:rPr>
-        <w:t xml:space="preserve"> </w:t>
-      </w:r>
-      <w:r>
-        <w:rPr>
-          <w:sz w:val="24"/>
-        </w:rPr>
-        <w:t>SPP</w:t>
-      </w:r>
-      <w:r>
-        <w:rPr>
-          <w:spacing w:val="-27"/>
-          <w:sz w:val="24"/>
-        </w:rPr>
-        <w:t xml:space="preserve"> </w:t>
-      </w:r>
-      <w:r>
-        <w:rPr>
-          <w:sz w:val="24"/>
-        </w:rPr>
-        <w:t>(least</w:t>
-      </w:r>
-      <w:r>
-        <w:rPr>
-          <w:spacing w:val="-28"/>
-          <w:sz w:val="24"/>
-        </w:rPr>
-        <w:t xml:space="preserve"> </w:t>
-      </w:r>
-      <w:r>
-        <w:rPr>
-          <w:sz w:val="24"/>
-        </w:rPr>
-        <w:t>squares), optionally apply weights; generate</w:t>
-      </w:r>
-      <w:r>
-        <w:rPr>
-          <w:spacing w:val="-6"/>
-          <w:sz w:val="24"/>
-        </w:rPr>
-        <w:t xml:space="preserve"> </w:t>
-      </w:r>
-      <w:r>
-        <w:rPr>
-          <w:sz w:val="24"/>
-        </w:rPr>
-        <w:t>plots/tables.</w:t>
-      </w:r>
-    </w:p>
-    <w:p>
-      <w:pPr>
-        <w:pStyle w:val="a3"/>
-        <w:spacing w:before="7" w:line="288" w:lineRule="auto"/>
-        <w:rPr>
-          <w:sz w:val="39"/>
+        <w:spacing w:before="10" w:line="288" w:lineRule="auto"/>
+        <w:rPr>
+          <w:sz w:val="46"/>
         </w:rPr>
       </w:pPr>
     </w:p>
@@ -5995,177 +5829,7 @@
           <w:spacing w:val="-12"/>
           <w:sz w:val="24"/>
         </w:rPr>
-        <w:t>P.</w:t>
-      </w:r>
-      <w:r>
-        <w:rPr>
-          <w:spacing w:val="-23"/>
-          <w:sz w:val="24"/>
-        </w:rPr>
-        <w:t xml:space="preserve"> </w:t>
-      </w:r>
-      <w:r>
-        <w:rPr>
-          <w:sz w:val="24"/>
-        </w:rPr>
-        <w:t>Misra</w:t>
-      </w:r>
-      <w:r>
-        <w:rPr>
-          <w:spacing w:val="-23"/>
-          <w:sz w:val="24"/>
-        </w:rPr>
-        <w:t xml:space="preserve"> </w:t>
-      </w:r>
-      <w:r>
-        <w:rPr>
-          <w:sz w:val="24"/>
-        </w:rPr>
-        <w:t>and</w:t>
-      </w:r>
-      <w:r>
-        <w:rPr>
-          <w:spacing w:val="-23"/>
-          <w:sz w:val="24"/>
-        </w:rPr>
-        <w:t xml:space="preserve"> </w:t>
-      </w:r>
-      <w:r>
-        <w:rPr>
-          <w:spacing w:val="-12"/>
-          <w:sz w:val="24"/>
-        </w:rPr>
-        <w:t>P.</w:t>
-      </w:r>
-      <w:r>
-        <w:rPr>
-          <w:spacing w:val="-23"/>
-          <w:sz w:val="24"/>
-        </w:rPr>
-        <w:t xml:space="preserve"> </w:t>
-      </w:r>
-      <w:r>
-        <w:rPr>
-          <w:sz w:val="24"/>
-        </w:rPr>
-        <w:t>Enge,</w:t>
-      </w:r>
-      <w:r>
-        <w:rPr>
-          <w:spacing w:val="-19"/>
-          <w:sz w:val="24"/>
-        </w:rPr>
-        <w:t xml:space="preserve"> </w:t>
-      </w:r>
-      <w:r>
-        <w:rPr>
-          <w:sz w:val="24"/>
-        </w:rPr>
-        <w:t>GPS:</w:t>
-      </w:r>
-      <w:r>
-        <w:rPr>
-          <w:spacing w:val="-23"/>
-          <w:sz w:val="24"/>
-        </w:rPr>
-        <w:t xml:space="preserve"> </w:t>
-      </w:r>
-      <w:r>
-        <w:rPr>
-          <w:sz w:val="24"/>
-        </w:rPr>
-        <w:t>Signals,</w:t>
-      </w:r>
-      <w:r>
-        <w:rPr>
-          <w:spacing w:val="-19"/>
-          <w:sz w:val="24"/>
-        </w:rPr>
-        <w:t xml:space="preserve"> </w:t>
-      </w:r>
-      <w:r>
-        <w:rPr>
-          <w:sz w:val="24"/>
-        </w:rPr>
-        <w:t>Measurements,</w:t>
-      </w:r>
-      <w:r>
-        <w:rPr>
-          <w:spacing w:val="-20"/>
-          <w:sz w:val="24"/>
-        </w:rPr>
-        <w:t xml:space="preserve"> </w:t>
-      </w:r>
-      <w:r>
-        <w:rPr>
-          <w:sz w:val="24"/>
-        </w:rPr>
-        <w:t>and</w:t>
-      </w:r>
-      <w:r>
-        <w:rPr>
-          <w:spacing w:val="-22"/>
-          <w:sz w:val="24"/>
-        </w:rPr>
-        <w:t xml:space="preserve"> </w:t>
-      </w:r>
-      <w:r>
-        <w:rPr>
-          <w:sz w:val="24"/>
-        </w:rPr>
-        <w:t>Performance,</w:t>
-      </w:r>
-      <w:r>
-        <w:rPr>
-          <w:spacing w:val="-20"/>
-          <w:sz w:val="24"/>
-        </w:rPr>
-        <w:t xml:space="preserve"> </w:t>
-      </w:r>
-      <w:r>
-        <w:rPr>
-          <w:sz w:val="24"/>
-        </w:rPr>
-        <w:t>2nd</w:t>
-      </w:r>
-      <w:r>
-        <w:rPr>
-          <w:spacing w:val="-22"/>
-          <w:sz w:val="24"/>
-        </w:rPr>
-        <w:t xml:space="preserve"> </w:t>
-      </w:r>
-      <w:r>
-        <w:rPr>
-          <w:sz w:val="24"/>
-        </w:rPr>
-        <w:t>ed.,</w:t>
-      </w:r>
-      <w:r>
-        <w:rPr>
-          <w:spacing w:val="-20"/>
-          <w:sz w:val="24"/>
-        </w:rPr>
-        <w:t xml:space="preserve"> </w:t>
-      </w:r>
-      <w:r>
-        <w:rPr>
-          <w:sz w:val="24"/>
-        </w:rPr>
-        <w:t>Ganga-Jamuna Press,</w:t>
-      </w:r>
-      <w:r>
-        <w:rPr>
-          <w:spacing w:val="-2"/>
-          <w:sz w:val="24"/>
-        </w:rPr>
-        <w:t xml:space="preserve"> </w:t>
-      </w:r>
-      <w:r>
-        <w:rPr>
-          <w:sz w:val="24"/>
-        </w:rPr>
-        <w:t>2011.</w:t>
+        <w:t>P. Misra and P. Enge, Global Positioning System: Signals, Measurements, and Performance, 2nd ed., Ganga-Jamuna Press, 2011.</w:t>
       </w:r>
     </w:p>
     <w:p>
@@ -6191,39 +5855,33 @@
           <w:spacing w:val="-12"/>
           <w:sz w:val="24"/>
         </w:rPr>
-        <w:t xml:space="preserve">P. </w:t>
-      </w:r>
-      <w:r>
+        <w:t>P. J. G. Teunissen and O. Montenbruck (Eds.), Springer Handbook of Global Navigation Satellite Systems, Springer, 2017.</w:t>
+      </w:r>
+    </w:p>
+    <w:p>
+      <w:pPr>
+        <w:pStyle w:val="a8"/>
+        <w:numPr>
+          <w:ilvl w:val="1"/>
+          <w:numId w:val="1"/>
+        </w:numPr>
+        <w:tabs>
+          <w:tab w:val="left" w:pos="940"/>
+        </w:tabs>
+        <w:spacing w:line="288" w:lineRule="auto"/>
+        <w:ind w:left="941" w:hanging="397"/>
         <w:rPr>
           <w:sz w:val="24"/>
         </w:rPr>
-        <w:t xml:space="preserve">J. G. </w:t>
-      </w:r>
-      <w:r>
-        <w:rPr>
-          <w:spacing w:val="-3"/>
+      </w:pPr>
+      <w:bookmarkStart w:id="10" w:name="_bookmark3"/>
+      <w:bookmarkEnd w:id="10"/>
+      <w:r>
+        <w:rPr>
+          <w:spacing w:val="-12"/>
           <w:sz w:val="24"/>
         </w:rPr>
-        <w:t xml:space="preserve">Teunissen </w:t>
-      </w:r>
-      <w:r>
-        <w:rPr>
-          <w:sz w:val="24"/>
-        </w:rPr>
-        <w:t>and O. Montenbruck, Springer Handbook of GNSS, Springer,</w:t>
-      </w:r>
-      <w:r>
-        <w:rPr>
-          <w:spacing w:val="-17"/>
-          <w:sz w:val="24"/>
-        </w:rPr>
-        <w:t xml:space="preserve"> </w:t>
-      </w:r>
-      <w:r>
-        <w:rPr>
-          <w:sz w:val="24"/>
-        </w:rPr>
-        <w:t>2017.</w:t>
+        <w:t>L.-T. Hsu et al., “UrbanNav: An open-sourced multisensory dataset for benchmarking positioning algorithms designed for urban areas,” in Proc. ION GNSS+ 2021, pp. 226–256.</w:t>
       </w:r>
     </w:p>
     <w:p>
@@ -6307,17 +5965,11 @@
       <w:bookmarkEnd w:id="12"/>
       <w:r>
         <w:rPr>
-          <w:rFonts w:eastAsia="宋体" w:hint="eastAsia"/>
+          <w:rFonts w:eastAsia="SimSun" w:hint="eastAsia"/>
           <w:color w:val="000000"/>
           <w:lang w:eastAsia="zh-CN"/>
         </w:rPr>
-        <w:t xml:space="preserve">B </w:t>
-      </w:r>
-      <w:r>
-        <w:rPr>
-          <w:color w:val="000000"/>
-        </w:rPr>
-        <w:t>Citation and Cross-Reference</w:t>
+        <w:t>B Key AI Prompts</w:t>
       </w:r>
     </w:p>
     <w:p>
@@ -6330,28 +5982,7 @@
         <w:rPr>
           <w:w w:val="105"/>
         </w:rPr>
-        <w:t>Cite</w:t>
-      </w:r>
-      <w:r>
-        <w:rPr>
-          <w:spacing w:val="-42"/>
-          <w:w w:val="105"/>
-        </w:rPr>
-        <w:t xml:space="preserve"> </w:t>
-      </w:r>
-      <w:r>
-        <w:rPr>
-          <w:rFonts w:eastAsia="宋体" w:hint="eastAsia"/>
-          <w:w w:val="105"/>
-          <w:lang w:eastAsia="zh-CN"/>
-        </w:rPr>
-        <w:t>related references in your report</w:t>
-      </w:r>
-      <w:r>
-        <w:rPr>
-          <w:w w:val="135"/>
-        </w:rPr>
-        <w:t>.</w:t>
+        <w:t>List the key prompts given to AI tools and summarise how each output was verified.</w:t>
       </w:r>
       <w:bookmarkStart w:id="13" w:name="Compilation_Notes"/>
       <w:bookmarkEnd w:id="13"/>
@@ -6423,7 +6054,7 @@
       <w:rPr>
         <w:sz w:val="20"/>
       </w:rPr>
-      <w:t xml:space="preserve"> of 5</w:t>
+      <w:t xml:space="preserve"/>
     </w:r>
   </w:p>
   <w:p>
@@ -6433,6 +6064,36 @@
       <w:rPr>
         <w:sz w:val="19"/>
       </w:rPr>
+    </w:pPr>
+  </w:p>
+</w:ftr>
+</file>
+
+<file path=word/footer2.xml><?xml version="1.0" encoding="utf-8"?>
+<w:ftr xmlns:m="http://schemas.openxmlformats.org/officeDocument/2006/math" xmlns:mc="http://schemas.openxmlformats.org/markup-compatibility/2006" xmlns:mo="http://schemas.microsoft.com/office/mac/office/2008/main" xmlns:mv="urn:schemas-microsoft-com:mac:vml" xmlns:o="urn:schemas-microsoft-com:office:office" xmlns:r="http://schemas.openxmlformats.org/officeDocument/2006/relationships" xmlns:v="urn:schemas-microsoft-com:vml" xmlns:w10="urn:schemas-microsoft-com:office:word" xmlns:w14="http://schemas.microsoft.com/office/word/2010/wordml" xmlns:w="http://schemas.openxmlformats.org/wordprocessingml/2006/main" xmlns:wne="http://schemas.microsoft.com/office/word/2006/wordml" xmlns:wp14="http://schemas.microsoft.com/office/word/2010/wordprocessingDrawing" xmlns:wp="http://schemas.openxmlformats.org/drawingml/2006/wordprocessingDrawing" xmlns:wpc="http://schemas.microsoft.com/office/word/2010/wordprocessingCanvas" xmlns:wpg="http://schemas.microsoft.com/office/word/2010/wordprocessingGroup" xmlns:wpi="http://schemas.microsoft.com/office/word/2010/wordprocessingInk" xmlns:wps="http://schemas.microsoft.com/office/word/2010/wordprocessingShape" mc:Ignorable="w14 wp14">
+  <w:p>
+    <w:pPr>
+      <w:pStyle w:val="Footer"/>
+    </w:pPr>
+  </w:p>
+</w:ftr>
+</file>
+
+<file path=word/footer3.xml><?xml version="1.0" encoding="utf-8"?>
+<w:ftr xmlns:m="http://schemas.openxmlformats.org/officeDocument/2006/math" xmlns:mc="http://schemas.openxmlformats.org/markup-compatibility/2006" xmlns:mo="http://schemas.microsoft.com/office/mac/office/2008/main" xmlns:mv="urn:schemas-microsoft-com:mac:vml" xmlns:o="urn:schemas-microsoft-com:office:office" xmlns:r="http://schemas.openxmlformats.org/officeDocument/2006/relationships" xmlns:v="urn:schemas-microsoft-com:vml" xmlns:w10="urn:schemas-microsoft-com:office:word" xmlns:w14="http://schemas.microsoft.com/office/word/2010/wordml" xmlns:w="http://schemas.openxmlformats.org/wordprocessingml/2006/main" xmlns:wne="http://schemas.microsoft.com/office/word/2006/wordml" xmlns:wp14="http://schemas.microsoft.com/office/word/2010/wordprocessingDrawing" xmlns:wp="http://schemas.openxmlformats.org/drawingml/2006/wordprocessingDrawing" xmlns:wpc="http://schemas.microsoft.com/office/word/2010/wordprocessingCanvas" xmlns:wpg="http://schemas.microsoft.com/office/word/2010/wordprocessingGroup" xmlns:wpi="http://schemas.microsoft.com/office/word/2010/wordprocessingInk" xmlns:wps="http://schemas.microsoft.com/office/word/2010/wordprocessingShape" mc:Ignorable="w14 wp14">
+  <w:p>
+    <w:pPr>
+      <w:pStyle w:val="Footer"/>
+    </w:pPr>
+  </w:p>
+</w:ftr>
+</file>
+
+<file path=word/footer4.xml><?xml version="1.0" encoding="utf-8"?>
+<w:ftr xmlns:m="http://schemas.openxmlformats.org/officeDocument/2006/math" xmlns:mc="http://schemas.openxmlformats.org/markup-compatibility/2006" xmlns:mo="http://schemas.microsoft.com/office/mac/office/2008/main" xmlns:mv="urn:schemas-microsoft-com:mac:vml" xmlns:o="urn:schemas-microsoft-com:office:office" xmlns:r="http://schemas.openxmlformats.org/officeDocument/2006/relationships" xmlns:v="urn:schemas-microsoft-com:vml" xmlns:w10="urn:schemas-microsoft-com:office:word" xmlns:w14="http://schemas.microsoft.com/office/word/2010/wordml" xmlns:w="http://schemas.openxmlformats.org/wordprocessingml/2006/main" xmlns:wne="http://schemas.microsoft.com/office/word/2006/wordml" xmlns:wp14="http://schemas.microsoft.com/office/word/2010/wordprocessingDrawing" xmlns:wp="http://schemas.openxmlformats.org/drawingml/2006/wordprocessingDrawing" xmlns:wpc="http://schemas.microsoft.com/office/word/2010/wordprocessingCanvas" xmlns:wpg="http://schemas.microsoft.com/office/word/2010/wordprocessingGroup" xmlns:wpi="http://schemas.microsoft.com/office/word/2010/wordprocessingInk" xmlns:wps="http://schemas.microsoft.com/office/word/2010/wordprocessingShape" mc:Ignorable="w14 wp14">
+  <w:p>
+    <w:pPr>
+      <w:pStyle w:val="Footer"/>
     </w:pPr>
   </w:p>
 </w:ftr>
@@ -6776,7 +6437,7 @@
   <w:docDefaults>
     <w:rPrDefault>
       <w:rPr>
-        <w:rFonts w:ascii="Times New Roman" w:eastAsia="宋体" w:hAnsi="Times New Roman" w:cs="Times New Roman"/>
+        <w:rFonts w:ascii="Times New Roman" w:eastAsia="SimSun" w:hAnsi="Times New Roman" w:cs="Times New Roman"/>
         <w:lang w:val="en-US" w:eastAsia="zh-CN" w:bidi="ar-SA"/>
       </w:rPr>
     </w:rPrDefault>
@@ -7199,7 +6860,7 @@
       </w:tabs>
     </w:pPr>
     <w:rPr>
-      <w:rFonts w:ascii="宋体" w:eastAsia="宋体" w:hAnsi="宋体" w:hint="eastAsia"/>
+      <w:rFonts w:ascii="SimSun" w:eastAsia="SimSun" w:hAnsi="SimSun" w:hint="eastAsia"/>
       <w:sz w:val="24"/>
       <w:szCs w:val="24"/>
       <w:lang w:eastAsia="zh-CN"/>
@@ -7330,10 +6991,10 @@
         <a:latin typeface="Cambria"/>
         <a:ea typeface=""/>
         <a:cs typeface=""/>
-        <a:font script="Jpan" typeface="ＭＳ ゴシック"/>
+        <a:font script="Jpan" typeface="MS Gothic"/>
         <a:font script="Hang" typeface="맑은 고딕"/>
-        <a:font script="Hans" typeface="宋体"/>
-        <a:font script="Hant" typeface="新細明體"/>
+        <a:font script="Hans" typeface="SimSun"/>
+        <a:font script="Hant" typeface="PMingLiU"/>
         <a:font script="Arab" typeface="Times New Roman"/>
         <a:font script="Hebr" typeface="Times New Roman"/>
         <a:font script="Thai" typeface="Angsana New"/>
@@ -7364,10 +7025,10 @@
         <a:latin typeface="Calibri"/>
         <a:ea typeface=""/>
         <a:cs typeface=""/>
-        <a:font script="Jpan" typeface="ＭＳ 明朝"/>
+        <a:font script="Jpan" typeface="MS Mincho"/>
         <a:font script="Hang" typeface="맑은 고딕"/>
-        <a:font script="Hans" typeface="宋体"/>
-        <a:font script="Hant" typeface="新細明體"/>
+        <a:font script="Hans" typeface="SimSun"/>
+        <a:font script="Hant" typeface="PMingLiU"/>
         <a:font script="Arab" typeface="Arial"/>
         <a:font script="Hebr" typeface="Arial"/>
         <a:font script="Thai" typeface="Cordia New"/>

</xml_diff>